<commit_message>
docs: personalize presentation and project guide with Team SankalpX and members
</commit_message>
<xml_diff>
--- a/GramSetu_Project_Overview_and_System_Guide.docx
+++ b/GramSetu_Project_Overview_and_System_Guide.docx
@@ -42,6 +42,108 @@
         <w:gridCol w:w="4680"/>
         <w:gridCol w:w="4680"/>
       </w:tblGrid>
+      <w:tr>
+        <w:tc>
+          <w:tcPr>
+            <w:tcW w:type="dxa" w:w="3168"/>
+            <w:shd w:fill="F1F5F9"/>
+            <w:tcMar>
+              <w:top w:w="60" w:type="dxa"/>
+              <w:bottom w:w="60" w:type="dxa"/>
+              <w:left w:w="100" w:type="dxa"/>
+              <w:right w:w="100" w:type="dxa"/>
+            </w:tcMar>
+          </w:tcPr>
+          <w:p>
+            <w:pPr>
+              <w:spacing w:before="20" w:after="20"/>
+            </w:pPr>
+            <w:r>
+              <w:rPr>
+                <w:b/>
+                <w:color w:val="0A2540"/>
+                <w:sz w:val="19"/>
+              </w:rPr>
+              <w:t>Team Name &amp; ID:</w:t>
+            </w:r>
+          </w:p>
+        </w:tc>
+        <w:tc>
+          <w:tcPr>
+            <w:tcW w:type="dxa" w:w="6192"/>
+            <w:shd w:fill="FFFFFF"/>
+            <w:tcMar>
+              <w:top w:w="60" w:type="dxa"/>
+              <w:bottom w:w="60" w:type="dxa"/>
+              <w:left w:w="100" w:type="dxa"/>
+              <w:right w:w="100" w:type="dxa"/>
+            </w:tcMar>
+          </w:tcPr>
+          <w:p>
+            <w:pPr>
+              <w:spacing w:before="20" w:after="20"/>
+            </w:pPr>
+            <w:r>
+              <w:rPr>
+                <w:color w:val="334155"/>
+                <w:sz w:val="19"/>
+              </w:rPr>
+              <w:t>SankalpX (SIH 2026)</w:t>
+            </w:r>
+          </w:p>
+        </w:tc>
+      </w:tr>
+      <w:tr>
+        <w:tc>
+          <w:tcPr>
+            <w:tcW w:type="dxa" w:w="3168"/>
+            <w:shd w:fill="F1F5F9"/>
+            <w:tcMar>
+              <w:top w:w="60" w:type="dxa"/>
+              <w:bottom w:w="60" w:type="dxa"/>
+              <w:left w:w="100" w:type="dxa"/>
+              <w:right w:w="100" w:type="dxa"/>
+            </w:tcMar>
+          </w:tcPr>
+          <w:p>
+            <w:pPr>
+              <w:spacing w:before="20" w:after="20"/>
+            </w:pPr>
+            <w:r>
+              <w:rPr>
+                <w:b/>
+                <w:color w:val="0A2540"/>
+                <w:sz w:val="19"/>
+              </w:rPr>
+              <w:t>Team Members:</w:t>
+            </w:r>
+          </w:p>
+        </w:tc>
+        <w:tc>
+          <w:tcPr>
+            <w:tcW w:type="dxa" w:w="6192"/>
+            <w:shd w:fill="FFFFFF"/>
+            <w:tcMar>
+              <w:top w:w="60" w:type="dxa"/>
+              <w:bottom w:w="60" w:type="dxa"/>
+              <w:left w:w="100" w:type="dxa"/>
+              <w:right w:w="100" w:type="dxa"/>
+            </w:tcMar>
+          </w:tcPr>
+          <w:p>
+            <w:pPr>
+              <w:spacing w:before="20" w:after="20"/>
+            </w:pPr>
+            <w:r>
+              <w:rPr>
+                <w:color w:val="334155"/>
+                <w:sz w:val="19"/>
+              </w:rPr>
+              <w:t>More Sanjivani, Deshmukh Anushka, Thorat Saujanya, Nehe Dhanshri, Khurud Tanushri, Dhokchaule Omsaish</w:t>
+            </w:r>
+          </w:p>
+        </w:tc>
+      </w:tr>
       <w:tr>
         <w:tc>
           <w:tcPr>

</xml_diff>